<commit_message>
second and third labs
</commit_message>
<xml_diff>
--- a/templates/reference.docx
+++ b/templates/reference.docx
@@ -408,7 +408,7 @@
     <w:pPr>
       <w:spacing w:after="120" w:before="240" w:line="360" w:lineRule="auto"/>
       <w:ind w:firstLine="0"/>
-      <w:jc w:val="left"/>
+      <w:jc w:val="center"/>
       <w:outlineLvl w:val="0"/>
     </w:pPr>
     <w:rPr>
@@ -427,7 +427,7 @@
     <w:qFormat/>
     <w:pPr>
       <w:spacing w:after="80" w:before="160" w:line="360" w:lineRule="auto"/>
-      <w:ind w:firstLine="0"/>
+      <w:ind w:firstLine="709"/>
       <w:jc w:val="left"/>
       <w:outlineLvl w:val="1"/>
     </w:pPr>
@@ -447,7 +447,7 @@
     <w:qFormat/>
     <w:pPr>
       <w:spacing w:after="60" w:before="120" w:line="360" w:lineRule="auto"/>
-      <w:ind w:firstLine="0"/>
+      <w:ind w:firstLine="709"/>
       <w:jc w:val="left"/>
       <w:outlineLvl w:val="2"/>
     </w:pPr>
@@ -492,22 +492,38 @@
       <w:szCs w:val="28"/>
     </w:rPr>
   </w:style>
-  <w:style w:type="paragraph" w:styleId="Caption">
-    <w:name w:val="Caption"/>
-    <w:basedOn w:val="Normal"/>
-    <w:pPr>
-      <w:spacing w:after="120" w:before="60" w:line="360" w:lineRule="auto"/>
+  <w:style w:type="paragraph" w:styleId="ImageCaption">
+    <w:name w:val="Image Caption"/>
+    <w:basedOn w:val="Normal"/>
+    <w:pPr>
+      <w:spacing w:after="0" w:before="0" w:line="360" w:lineRule="auto"/>
       <w:ind w:firstLine="0"/>
       <w:jc w:val="center"/>
     </w:pPr>
     <w:rPr>
       <w:rFonts w:ascii="Times New Roman" w:cs="Times New Roman" w:eastAsia="Times New Roman" w:hAnsi="Times New Roman"/>
-      <w:i/>
-      <w:iCs/>
       <w:color w:val="000000"/>
-      <w:sz w:val="24"/>
-      <w:szCs w:val="24"/>
-    </w:rPr>
+      <w:sz w:val="28"/>
+      <w:szCs w:val="28"/>
+    </w:rPr>
+  </w:style>
+  <w:style w:type="paragraph" w:styleId="Figure">
+    <w:name w:val="Figure"/>
+    <w:basedOn w:val="Normal"/>
+    <w:pPr>
+      <w:spacing w:after="0" w:before="0" w:line="360" w:lineRule="auto"/>
+      <w:ind w:firstLine="0"/>
+      <w:jc w:val="center"/>
+    </w:pPr>
+  </w:style>
+  <w:style w:type="paragraph" w:styleId="CaptionedFigure">
+    <w:name w:val="Captioned Figure"/>
+    <w:basedOn w:val="Normal"/>
+    <w:pPr>
+      <w:spacing w:after="0" w:before="0" w:line="360" w:lineRule="auto"/>
+      <w:ind w:firstLine="0"/>
+      <w:jc w:val="center"/>
+    </w:pPr>
   </w:style>
   <w:style w:type="paragraph" w:styleId="FirstParagraph">
     <w:name w:val="First Paragraph"/>

</xml_diff>